<commit_message>
Configurando a pagina para paisagem
</commit_message>
<xml_diff>
--- a/Atividade6/Doc1.docx
+++ b/Atividade6/Doc1.docx
@@ -1,13 +1,18 @@
 
 <file path=word/document.xml><?xml version="1.0" encoding="utf-8"?>
-<w:document xmlns:wpc="http://schemas.microsoft.com/office/word/2010/wordprocessingCanvas" xmlns:cx="http://schemas.microsoft.com/office/drawing/2014/chartex" xmlns:cx1="http://schemas.microsoft.com/office/drawing/2015/9/8/chartex" xmlns:cx2="http://schemas.microsoft.com/office/drawing/2015/10/21/chartex" xmlns:cx3="http://schemas.microsoft.com/office/drawing/2016/5/9/chartex" xmlns:cx4="http://schemas.microsoft.com/office/drawing/2016/5/10/chartex" xmlns:cx5="http://schemas.microsoft.com/office/drawing/2016/5/11/chartex" xmlns:cx6="http://schemas.microsoft.com/office/drawing/2016/5/12/chartex" xmlns:cx7="http://schemas.microsoft.com/office/drawing/2016/5/13/chartex" xmlns:cx8="http://schemas.microsoft.com/office/drawing/2016/5/14/chartex" xmlns:mc="http://schemas.openxmlformats.org/markup-compatibility/2006" xmlns:aink="http://schemas.microsoft.com/office/drawing/2016/ink" xmlns:am3d="http://schemas.microsoft.com/office/drawing/2017/model3d" xmlns:o="urn:schemas-microsoft-com:office:office" xmlns:oel="http://schemas.microsoft.com/office/2019/extlst" xmlns:r="http://schemas.openxmlformats.org/officeDocument/2006/relationships" xmlns:m="http://schemas.openxmlformats.org/officeDocument/2006/math" xmlns:v="urn:schemas-microsoft-com:vml" xmlns:wp14="http://schemas.microsoft.com/office/word/2010/wordprocessingDrawing" xmlns:wp="http://schemas.openxmlformats.org/drawingml/2006/wordprocessingDrawing" xmlns:w10="urn:schemas-microsoft-com:office:word" xmlns:w="http://schemas.openxmlformats.org/wordprocessingml/2006/main" xmlns:w14="http://schemas.microsoft.com/office/word/2010/wordml" xmlns:w15="http://schemas.microsoft.com/office/word/2012/wordml" xmlns:w16cex="http://schemas.microsoft.com/office/word/2018/wordml/cex" xmlns:w16cid="http://schemas.microsoft.com/office/word/2016/wordml/cid" xmlns:w16="http://schemas.microsoft.com/office/word/2018/wordml" xmlns:w16sdtdh="http://schemas.microsoft.com/office/word/2020/wordml/sdtdatahash" xmlns:w16se="http://schemas.microsoft.com/office/word/2015/wordml/symex" xmlns:wpg="http://schemas.microsoft.com/office/word/2010/wordprocessingGroup" xmlns:wpi="http://schemas.microsoft.com/office/word/2010/wordprocessingInk" xmlns:wne="http://schemas.microsoft.com/office/word/2006/wordml" xmlns:wps="http://schemas.microsoft.com/office/word/2010/wordprocessingShape" mc:Ignorable="w14 w15 w16se w16cid w16 w16cex w16sdtdh wp14">
+<w:document xmlns:wpc="http://schemas.microsoft.com/office/word/2010/wordprocessingCanvas" xmlns:mc="http://schemas.openxmlformats.org/markup-compatibility/2006" xmlns:o="urn:schemas-microsoft-com:office:office" xmlns:r="http://schemas.openxmlformats.org/officeDocument/2006/relationships" xmlns:m="http://schemas.openxmlformats.org/officeDocument/2006/math" xmlns:v="urn:schemas-microsoft-com:vml" xmlns:wp14="http://schemas.microsoft.com/office/word/2010/wordprocessingDrawing" xmlns:wp="http://schemas.openxmlformats.org/drawingml/2006/wordprocessingDrawing" xmlns:w10="urn:schemas-microsoft-com:office:word" xmlns:w="http://schemas.openxmlformats.org/wordprocessingml/2006/main" xmlns:w14="http://schemas.microsoft.com/office/word/2010/wordml" xmlns:w15="http://schemas.microsoft.com/office/word/2012/wordml" xmlns:wpg="http://schemas.microsoft.com/office/word/2010/wordprocessingGroup" xmlns:wpi="http://schemas.microsoft.com/office/word/2010/wordprocessingInk" xmlns:wne="http://schemas.microsoft.com/office/word/2006/wordml" xmlns:wps="http://schemas.microsoft.com/office/word/2010/wordprocessingShape" mc:Ignorable="w14 w15 wp14">
   <w:body>
     <w:p>
+      <w:bookmarkStart w:id="0" w:name="_GoBack"/>
       <w:r>
+        <w:rPr>
+          <w:noProof/>
+          <w:lang w:eastAsia="pt-BR"/>
+        </w:rPr>
         <w:drawing>
-          <wp:inline distT="0" distB="0" distL="0" distR="0" wp14:anchorId="31E1080F" wp14:editId="2DE19A29">
-            <wp:extent cx="5400040" cy="2912745"/>
-            <wp:effectExtent l="0" t="0" r="0" b="1905"/>
+          <wp:inline distT="0" distB="0" distL="0" distR="0" wp14:anchorId="31E1080F" wp14:editId="1B5E76A6">
+            <wp:extent cx="9943265" cy="6543675"/>
+            <wp:effectExtent l="0" t="0" r="1270" b="0"/>
             <wp:docPr id="1" name="Imagem 1"/>
             <wp:cNvGraphicFramePr>
               <a:graphicFrameLocks xmlns:a="http://schemas.openxmlformats.org/drawingml/2006/main" noChangeAspect="1"/>
@@ -28,7 +33,7 @@
                   <pic:spPr>
                     <a:xfrm>
                       <a:off x="0" y="0"/>
-                      <a:ext cx="5400040" cy="2912745"/>
+                      <a:ext cx="9978573" cy="6566911"/>
                     </a:xfrm>
                     <a:prstGeom prst="rect">
                       <a:avLst/>
@@ -40,10 +45,11 @@
           </wp:inline>
         </w:drawing>
       </w:r>
+      <w:bookmarkEnd w:id="0"/>
     </w:p>
     <w:sectPr>
-      <w:pgSz w:w="11906" w:h="16838"/>
-      <w:pgMar w:top="1417" w:right="1701" w:bottom="1417" w:left="1701" w:header="708" w:footer="708" w:gutter="0"/>
+      <w:pgSz w:w="16838" w:h="11906" w:orient="landscape"/>
+      <w:pgMar w:top="680" w:right="851" w:bottom="851" w:left="680" w:header="709" w:footer="709" w:gutter="0"/>
       <w:cols w:space="708"/>
       <w:docGrid w:linePitch="360"/>
     </w:sectPr>
@@ -52,7 +58,7 @@
 </file>
 
 <file path=word/styles.xml><?xml version="1.0" encoding="utf-8"?>
-<w:styles xmlns:mc="http://schemas.openxmlformats.org/markup-compatibility/2006" xmlns:r="http://schemas.openxmlformats.org/officeDocument/2006/relationships" xmlns:w="http://schemas.openxmlformats.org/wordprocessingml/2006/main" xmlns:w14="http://schemas.microsoft.com/office/word/2010/wordml" xmlns:w15="http://schemas.microsoft.com/office/word/2012/wordml" xmlns:w16cex="http://schemas.microsoft.com/office/word/2018/wordml/cex" xmlns:w16cid="http://schemas.microsoft.com/office/word/2016/wordml/cid" xmlns:w16="http://schemas.microsoft.com/office/word/2018/wordml" xmlns:w16sdtdh="http://schemas.microsoft.com/office/word/2020/wordml/sdtdatahash" xmlns:w16se="http://schemas.microsoft.com/office/word/2015/wordml/symex" mc:Ignorable="w14 w15 w16se w16cid w16 w16cex w16sdtdh">
+<w:styles xmlns:mc="http://schemas.openxmlformats.org/markup-compatibility/2006" xmlns:r="http://schemas.openxmlformats.org/officeDocument/2006/relationships" xmlns:w="http://schemas.openxmlformats.org/wordprocessingml/2006/main" xmlns:w14="http://schemas.microsoft.com/office/word/2010/wordml" xmlns:w15="http://schemas.microsoft.com/office/word/2012/wordml" mc:Ignorable="w14 w15">
   <w:docDefaults>
     <w:rPrDefault>
       <w:rPr>
@@ -70,7 +76,7 @@
       </w:pPr>
     </w:pPrDefault>
   </w:docDefaults>
-  <w:latentStyles w:defLockedState="0" w:defUIPriority="99" w:defSemiHidden="0" w:defUnhideWhenUsed="0" w:defQFormat="0" w:count="376">
+  <w:latentStyles w:defLockedState="0" w:defUIPriority="99" w:defSemiHidden="0" w:defUnhideWhenUsed="0" w:defQFormat="0" w:count="371">
     <w:lsdException w:name="Normal" w:uiPriority="0" w:qFormat="1"/>
     <w:lsdException w:name="heading 1" w:uiPriority="9" w:qFormat="1"/>
     <w:lsdException w:name="heading 2" w:semiHidden="1" w:uiPriority="9" w:unhideWhenUsed="1" w:qFormat="1"/>
@@ -442,11 +448,6 @@
     <w:lsdException w:name="List Table 5 Dark Accent 6" w:uiPriority="50"/>
     <w:lsdException w:name="List Table 6 Colorful Accent 6" w:uiPriority="51"/>
     <w:lsdException w:name="List Table 7 Colorful Accent 6" w:uiPriority="52"/>
-    <w:lsdException w:name="Mention" w:semiHidden="1" w:unhideWhenUsed="1"/>
-    <w:lsdException w:name="Smart Hyperlink" w:semiHidden="1" w:unhideWhenUsed="1"/>
-    <w:lsdException w:name="Hashtag" w:semiHidden="1" w:unhideWhenUsed="1"/>
-    <w:lsdException w:name="Unresolved Mention" w:semiHidden="1" w:unhideWhenUsed="1"/>
-    <w:lsdException w:name="Smart Link" w:semiHidden="1" w:unhideWhenUsed="1"/>
   </w:latentStyles>
   <w:style w:type="paragraph" w:default="1" w:styleId="Normal">
     <w:name w:val="Normal"/>

</xml_diff>

<commit_message>
Atualizar o arquivo docx com as figuras separadas
</commit_message>
<xml_diff>
--- a/Atividade6/Doc1.docx
+++ b/Atividade6/Doc1.docx
@@ -1,18 +1,13 @@
 
 <file path=word/document.xml><?xml version="1.0" encoding="utf-8"?>
-<w:document xmlns:wpc="http://schemas.microsoft.com/office/word/2010/wordprocessingCanvas" xmlns:mc="http://schemas.openxmlformats.org/markup-compatibility/2006" xmlns:o="urn:schemas-microsoft-com:office:office" xmlns:r="http://schemas.openxmlformats.org/officeDocument/2006/relationships" xmlns:m="http://schemas.openxmlformats.org/officeDocument/2006/math" xmlns:v="urn:schemas-microsoft-com:vml" xmlns:wp14="http://schemas.microsoft.com/office/word/2010/wordprocessingDrawing" xmlns:wp="http://schemas.openxmlformats.org/drawingml/2006/wordprocessingDrawing" xmlns:w10="urn:schemas-microsoft-com:office:word" xmlns:w="http://schemas.openxmlformats.org/wordprocessingml/2006/main" xmlns:w14="http://schemas.microsoft.com/office/word/2010/wordml" xmlns:w15="http://schemas.microsoft.com/office/word/2012/wordml" xmlns:wpg="http://schemas.microsoft.com/office/word/2010/wordprocessingGroup" xmlns:wpi="http://schemas.microsoft.com/office/word/2010/wordprocessingInk" xmlns:wne="http://schemas.microsoft.com/office/word/2006/wordml" xmlns:wps="http://schemas.microsoft.com/office/word/2010/wordprocessingShape" mc:Ignorable="w14 w15 wp14">
+<w:document xmlns:wpc="http://schemas.microsoft.com/office/word/2010/wordprocessingCanvas" xmlns:cx="http://schemas.microsoft.com/office/drawing/2014/chartex" xmlns:cx1="http://schemas.microsoft.com/office/drawing/2015/9/8/chartex" xmlns:cx2="http://schemas.microsoft.com/office/drawing/2015/10/21/chartex" xmlns:cx3="http://schemas.microsoft.com/office/drawing/2016/5/9/chartex" xmlns:cx4="http://schemas.microsoft.com/office/drawing/2016/5/10/chartex" xmlns:cx5="http://schemas.microsoft.com/office/drawing/2016/5/11/chartex" xmlns:cx6="http://schemas.microsoft.com/office/drawing/2016/5/12/chartex" xmlns:cx7="http://schemas.microsoft.com/office/drawing/2016/5/13/chartex" xmlns:cx8="http://schemas.microsoft.com/office/drawing/2016/5/14/chartex" xmlns:mc="http://schemas.openxmlformats.org/markup-compatibility/2006" xmlns:aink="http://schemas.microsoft.com/office/drawing/2016/ink" xmlns:am3d="http://schemas.microsoft.com/office/drawing/2017/model3d" xmlns:o="urn:schemas-microsoft-com:office:office" xmlns:oel="http://schemas.microsoft.com/office/2019/extlst" xmlns:r="http://schemas.openxmlformats.org/officeDocument/2006/relationships" xmlns:m="http://schemas.openxmlformats.org/officeDocument/2006/math" xmlns:v="urn:schemas-microsoft-com:vml" xmlns:wp14="http://schemas.microsoft.com/office/word/2010/wordprocessingDrawing" xmlns:wp="http://schemas.openxmlformats.org/drawingml/2006/wordprocessingDrawing" xmlns:w10="urn:schemas-microsoft-com:office:word" xmlns:w="http://schemas.openxmlformats.org/wordprocessingml/2006/main" xmlns:w14="http://schemas.microsoft.com/office/word/2010/wordml" xmlns:w15="http://schemas.microsoft.com/office/word/2012/wordml" xmlns:w16cex="http://schemas.microsoft.com/office/word/2018/wordml/cex" xmlns:w16cid="http://schemas.microsoft.com/office/word/2016/wordml/cid" xmlns:w16="http://schemas.microsoft.com/office/word/2018/wordml" xmlns:w16sdtdh="http://schemas.microsoft.com/office/word/2020/wordml/sdtdatahash" xmlns:w16se="http://schemas.microsoft.com/office/word/2015/wordml/symex" xmlns:wpg="http://schemas.microsoft.com/office/word/2010/wordprocessingGroup" xmlns:wpi="http://schemas.microsoft.com/office/word/2010/wordprocessingInk" xmlns:wne="http://schemas.microsoft.com/office/word/2006/wordml" xmlns:wps="http://schemas.microsoft.com/office/word/2010/wordprocessingShape" mc:Ignorable="w14 w15 w16se w16cid w16 w16cex w16sdtdh wp14">
   <w:body>
     <w:p>
-      <w:bookmarkStart w:id="0" w:name="_GoBack"/>
-      <w:r>
-        <w:rPr>
-          <w:noProof/>
-          <w:lang w:eastAsia="pt-BR"/>
-        </w:rPr>
+      <w:r>
         <w:drawing>
-          <wp:inline distT="0" distB="0" distL="0" distR="0" wp14:anchorId="31E1080F" wp14:editId="1B5E76A6">
-            <wp:extent cx="9943265" cy="6543675"/>
-            <wp:effectExtent l="0" t="0" r="1270" b="0"/>
+          <wp:inline distT="0" distB="0" distL="0" distR="0" wp14:anchorId="6DB57533" wp14:editId="471F4CB9">
+            <wp:extent cx="5612130" cy="5083810"/>
+            <wp:effectExtent l="0" t="0" r="7620" b="2540"/>
             <wp:docPr id="1" name="Imagem 1"/>
             <wp:cNvGraphicFramePr>
               <a:graphicFrameLocks xmlns:a="http://schemas.openxmlformats.org/drawingml/2006/main" noChangeAspect="1"/>
@@ -33,7 +28,7 @@
                   <pic:spPr>
                     <a:xfrm>
                       <a:off x="0" y="0"/>
-                      <a:ext cx="9978573" cy="6566911"/>
+                      <a:ext cx="5612130" cy="5083810"/>
                     </a:xfrm>
                     <a:prstGeom prst="rect">
                       <a:avLst/>
@@ -45,20 +40,200 @@
           </wp:inline>
         </w:drawing>
       </w:r>
-      <w:bookmarkEnd w:id="0"/>
     </w:p>
+    <w:p>
+      <w:r>
+        <w:t xml:space="preserve">Fig1 – código do </w:t>
+      </w:r>
+      <w:proofErr w:type="spellStart"/>
+      <w:r>
+        <w:t>javaScript</w:t>
+      </w:r>
+      <w:proofErr w:type="spellEnd"/>
+    </w:p>
+    <w:p/>
+    <w:p>
+      <w:r>
+        <w:lastRenderedPageBreak/>
+        <w:drawing>
+          <wp:inline distT="0" distB="0" distL="0" distR="0" wp14:anchorId="0C9F4FBE" wp14:editId="56C2F53A">
+            <wp:extent cx="3134162" cy="3943900"/>
+            <wp:effectExtent l="0" t="0" r="9525" b="0"/>
+            <wp:docPr id="4" name="Imagem 4"/>
+            <wp:cNvGraphicFramePr>
+              <a:graphicFrameLocks xmlns:a="http://schemas.openxmlformats.org/drawingml/2006/main" noChangeAspect="1"/>
+            </wp:cNvGraphicFramePr>
+            <a:graphic xmlns:a="http://schemas.openxmlformats.org/drawingml/2006/main">
+              <a:graphicData uri="http://schemas.openxmlformats.org/drawingml/2006/picture">
+                <pic:pic xmlns:pic="http://schemas.openxmlformats.org/drawingml/2006/picture">
+                  <pic:nvPicPr>
+                    <pic:cNvPr id="1" name=""/>
+                    <pic:cNvPicPr/>
+                  </pic:nvPicPr>
+                  <pic:blipFill>
+                    <a:blip r:embed="rId5"/>
+                    <a:stretch>
+                      <a:fillRect/>
+                    </a:stretch>
+                  </pic:blipFill>
+                  <pic:spPr>
+                    <a:xfrm>
+                      <a:off x="0" y="0"/>
+                      <a:ext cx="3134162" cy="3943900"/>
+                    </a:xfrm>
+                    <a:prstGeom prst="rect">
+                      <a:avLst/>
+                    </a:prstGeom>
+                  </pic:spPr>
+                </pic:pic>
+              </a:graphicData>
+            </a:graphic>
+          </wp:inline>
+        </w:drawing>
+      </w:r>
+    </w:p>
+    <w:p>
+      <w:proofErr w:type="spellStart"/>
+      <w:r>
+        <w:t>Fig</w:t>
+      </w:r>
+      <w:proofErr w:type="spellEnd"/>
+      <w:r>
+        <w:t xml:space="preserve"> 2 – </w:t>
+      </w:r>
+      <w:proofErr w:type="spellStart"/>
+      <w:r>
+        <w:t>Pagina</w:t>
+      </w:r>
+      <w:proofErr w:type="spellEnd"/>
+      <w:r>
+        <w:t xml:space="preserve"> </w:t>
+      </w:r>
+      <w:proofErr w:type="spellStart"/>
+      <w:r>
+        <w:t>html</w:t>
+      </w:r>
+      <w:proofErr w:type="spellEnd"/>
+    </w:p>
+    <w:p/>
+    <w:p>
+      <w:r>
+        <w:drawing>
+          <wp:inline distT="0" distB="0" distL="0" distR="0" wp14:anchorId="0A3BDBA7" wp14:editId="3566592E">
+            <wp:extent cx="4467849" cy="2781688"/>
+            <wp:effectExtent l="0" t="0" r="9525" b="0"/>
+            <wp:docPr id="2" name="Imagem 2"/>
+            <wp:cNvGraphicFramePr>
+              <a:graphicFrameLocks xmlns:a="http://schemas.openxmlformats.org/drawingml/2006/main" noChangeAspect="1"/>
+            </wp:cNvGraphicFramePr>
+            <a:graphic xmlns:a="http://schemas.openxmlformats.org/drawingml/2006/main">
+              <a:graphicData uri="http://schemas.openxmlformats.org/drawingml/2006/picture">
+                <pic:pic xmlns:pic="http://schemas.openxmlformats.org/drawingml/2006/picture">
+                  <pic:nvPicPr>
+                    <pic:cNvPr id="1" name=""/>
+                    <pic:cNvPicPr/>
+                  </pic:nvPicPr>
+                  <pic:blipFill>
+                    <a:blip r:embed="rId6"/>
+                    <a:stretch>
+                      <a:fillRect/>
+                    </a:stretch>
+                  </pic:blipFill>
+                  <pic:spPr>
+                    <a:xfrm>
+                      <a:off x="0" y="0"/>
+                      <a:ext cx="4467849" cy="2781688"/>
+                    </a:xfrm>
+                    <a:prstGeom prst="rect">
+                      <a:avLst/>
+                    </a:prstGeom>
+                  </pic:spPr>
+                </pic:pic>
+              </a:graphicData>
+            </a:graphic>
+          </wp:inline>
+        </w:drawing>
+      </w:r>
+    </w:p>
+    <w:p>
+      <w:proofErr w:type="spellStart"/>
+      <w:r>
+        <w:t>Fig</w:t>
+      </w:r>
+      <w:proofErr w:type="spellEnd"/>
+      <w:r>
+        <w:t xml:space="preserve"> 3 – saída do </w:t>
+      </w:r>
+      <w:proofErr w:type="spellStart"/>
+      <w:r>
+        <w:t>alert</w:t>
+      </w:r>
+      <w:proofErr w:type="spellEnd"/>
+    </w:p>
+    <w:p/>
+    <w:p>
+      <w:r>
+        <w:lastRenderedPageBreak/>
+        <w:drawing>
+          <wp:inline distT="0" distB="0" distL="0" distR="0" wp14:anchorId="740C4754" wp14:editId="16194A45">
+            <wp:extent cx="3953427" cy="2476846"/>
+            <wp:effectExtent l="0" t="0" r="9525" b="0"/>
+            <wp:docPr id="3" name="Imagem 3"/>
+            <wp:cNvGraphicFramePr>
+              <a:graphicFrameLocks xmlns:a="http://schemas.openxmlformats.org/drawingml/2006/main" noChangeAspect="1"/>
+            </wp:cNvGraphicFramePr>
+            <a:graphic xmlns:a="http://schemas.openxmlformats.org/drawingml/2006/main">
+              <a:graphicData uri="http://schemas.openxmlformats.org/drawingml/2006/picture">
+                <pic:pic xmlns:pic="http://schemas.openxmlformats.org/drawingml/2006/picture">
+                  <pic:nvPicPr>
+                    <pic:cNvPr id="1" name=""/>
+                    <pic:cNvPicPr/>
+                  </pic:nvPicPr>
+                  <pic:blipFill>
+                    <a:blip r:embed="rId7"/>
+                    <a:stretch>
+                      <a:fillRect/>
+                    </a:stretch>
+                  </pic:blipFill>
+                  <pic:spPr>
+                    <a:xfrm>
+                      <a:off x="0" y="0"/>
+                      <a:ext cx="3953427" cy="2476846"/>
+                    </a:xfrm>
+                    <a:prstGeom prst="rect">
+                      <a:avLst/>
+                    </a:prstGeom>
+                  </pic:spPr>
+                </pic:pic>
+              </a:graphicData>
+            </a:graphic>
+          </wp:inline>
+        </w:drawing>
+      </w:r>
+    </w:p>
+    <w:p>
+      <w:proofErr w:type="spellStart"/>
+      <w:r>
+        <w:t>Fig</w:t>
+      </w:r>
+      <w:proofErr w:type="spellEnd"/>
+      <w:r>
+        <w:t xml:space="preserve"> 4 – saída console</w:t>
+      </w:r>
+    </w:p>
+    <w:p/>
     <w:sectPr>
-      <w:pgSz w:w="16838" w:h="11906" w:orient="landscape"/>
-      <w:pgMar w:top="680" w:right="851" w:bottom="851" w:left="680" w:header="709" w:footer="709" w:gutter="0"/>
-      <w:cols w:space="708"/>
-      <w:docGrid w:linePitch="360"/>
+      <w:pgSz w:w="12240" w:h="15840"/>
+      <w:pgMar w:top="1417" w:right="1701" w:bottom="1417" w:left="1701" w:header="720" w:footer="720" w:gutter="0"/>
+      <w:cols w:space="720"/>
+      <w:noEndnote/>
     </w:sectPr>
   </w:body>
 </w:document>
 </file>
 
 <file path=word/styles.xml><?xml version="1.0" encoding="utf-8"?>
-<w:styles xmlns:mc="http://schemas.openxmlformats.org/markup-compatibility/2006" xmlns:r="http://schemas.openxmlformats.org/officeDocument/2006/relationships" xmlns:w="http://schemas.openxmlformats.org/wordprocessingml/2006/main" xmlns:w14="http://schemas.microsoft.com/office/word/2010/wordml" xmlns:w15="http://schemas.microsoft.com/office/word/2012/wordml" mc:Ignorable="w14 w15">
+<w:styles xmlns:mc="http://schemas.openxmlformats.org/markup-compatibility/2006" xmlns:r="http://schemas.openxmlformats.org/officeDocument/2006/relationships" xmlns:w="http://schemas.openxmlformats.org/wordprocessingml/2006/main" xmlns:w14="http://schemas.microsoft.com/office/word/2010/wordml" xmlns:w15="http://schemas.microsoft.com/office/word/2012/wordml" xmlns:w16cex="http://schemas.microsoft.com/office/word/2018/wordml/cex" xmlns:w16cid="http://schemas.microsoft.com/office/word/2016/wordml/cid" xmlns:w16="http://schemas.microsoft.com/office/word/2018/wordml" xmlns:w16sdtdh="http://schemas.microsoft.com/office/word/2020/wordml/sdtdatahash" xmlns:w16se="http://schemas.microsoft.com/office/word/2015/wordml/symex" mc:Ignorable="w14 w15 w16se w16cid w16 w16cex w16sdtdh">
   <w:docDefaults>
     <w:rPrDefault>
       <w:rPr>
@@ -76,7 +251,7 @@
       </w:pPr>
     </w:pPrDefault>
   </w:docDefaults>
-  <w:latentStyles w:defLockedState="0" w:defUIPriority="99" w:defSemiHidden="0" w:defUnhideWhenUsed="0" w:defQFormat="0" w:count="371">
+  <w:latentStyles w:defLockedState="0" w:defUIPriority="99" w:defSemiHidden="0" w:defUnhideWhenUsed="0" w:defQFormat="0" w:count="376">
     <w:lsdException w:name="Normal" w:uiPriority="0" w:qFormat="1"/>
     <w:lsdException w:name="heading 1" w:uiPriority="9" w:qFormat="1"/>
     <w:lsdException w:name="heading 2" w:semiHidden="1" w:uiPriority="9" w:unhideWhenUsed="1" w:qFormat="1"/>
@@ -448,6 +623,11 @@
     <w:lsdException w:name="List Table 5 Dark Accent 6" w:uiPriority="50"/>
     <w:lsdException w:name="List Table 6 Colorful Accent 6" w:uiPriority="51"/>
     <w:lsdException w:name="List Table 7 Colorful Accent 6" w:uiPriority="52"/>
+    <w:lsdException w:name="Mention" w:semiHidden="1" w:unhideWhenUsed="1"/>
+    <w:lsdException w:name="Smart Hyperlink" w:semiHidden="1" w:unhideWhenUsed="1"/>
+    <w:lsdException w:name="Hashtag" w:semiHidden="1" w:unhideWhenUsed="1"/>
+    <w:lsdException w:name="Unresolved Mention" w:semiHidden="1" w:unhideWhenUsed="1"/>
+    <w:lsdException w:name="Smart Link" w:semiHidden="1" w:unhideWhenUsed="1"/>
   </w:latentStyles>
   <w:style w:type="paragraph" w:default="1" w:styleId="Normal">
     <w:name w:val="Normal"/>
@@ -460,7 +640,7 @@
     <w:link w:val="Ttulo1Char"/>
     <w:uiPriority w:val="9"/>
     <w:qFormat/>
-    <w:rsid w:val="008418BB"/>
+    <w:rsid w:val="00447475"/>
     <w:pPr>
       <w:keepNext/>
       <w:keepLines/>
@@ -483,7 +663,7 @@
     <w:semiHidden/>
     <w:unhideWhenUsed/>
     <w:qFormat/>
-    <w:rsid w:val="008418BB"/>
+    <w:rsid w:val="00447475"/>
     <w:pPr>
       <w:keepNext/>
       <w:keepLines/>
@@ -506,7 +686,7 @@
     <w:semiHidden/>
     <w:unhideWhenUsed/>
     <w:qFormat/>
-    <w:rsid w:val="008418BB"/>
+    <w:rsid w:val="00447475"/>
     <w:pPr>
       <w:keepNext/>
       <w:keepLines/>
@@ -529,7 +709,7 @@
     <w:semiHidden/>
     <w:unhideWhenUsed/>
     <w:qFormat/>
-    <w:rsid w:val="008418BB"/>
+    <w:rsid w:val="00447475"/>
     <w:pPr>
       <w:keepNext/>
       <w:keepLines/>
@@ -552,7 +732,7 @@
     <w:semiHidden/>
     <w:unhideWhenUsed/>
     <w:qFormat/>
-    <w:rsid w:val="008418BB"/>
+    <w:rsid w:val="00447475"/>
     <w:pPr>
       <w:keepNext/>
       <w:keepLines/>
@@ -573,7 +753,7 @@
     <w:semiHidden/>
     <w:unhideWhenUsed/>
     <w:qFormat/>
-    <w:rsid w:val="008418BB"/>
+    <w:rsid w:val="00447475"/>
     <w:pPr>
       <w:keepNext/>
       <w:keepLines/>
@@ -596,7 +776,7 @@
     <w:semiHidden/>
     <w:unhideWhenUsed/>
     <w:qFormat/>
-    <w:rsid w:val="008418BB"/>
+    <w:rsid w:val="00447475"/>
     <w:pPr>
       <w:keepNext/>
       <w:keepLines/>
@@ -617,7 +797,7 @@
     <w:semiHidden/>
     <w:unhideWhenUsed/>
     <w:qFormat/>
-    <w:rsid w:val="008418BB"/>
+    <w:rsid w:val="00447475"/>
     <w:pPr>
       <w:keepNext/>
       <w:keepLines/>
@@ -640,7 +820,7 @@
     <w:semiHidden/>
     <w:unhideWhenUsed/>
     <w:qFormat/>
-    <w:rsid w:val="008418BB"/>
+    <w:rsid w:val="00447475"/>
     <w:pPr>
       <w:keepNext/>
       <w:keepLines/>
@@ -655,7 +835,6 @@
   <w:style w:type="character" w:default="1" w:styleId="Fontepargpadro">
     <w:name w:val="Default Paragraph Font"/>
     <w:uiPriority w:val="1"/>
-    <w:semiHidden/>
     <w:unhideWhenUsed/>
   </w:style>
   <w:style w:type="table" w:default="1" w:styleId="Tabelanormal">
@@ -684,7 +863,7 @@
     <w:basedOn w:val="Fontepargpadro"/>
     <w:link w:val="Ttulo1"/>
     <w:uiPriority w:val="9"/>
-    <w:rsid w:val="008418BB"/>
+    <w:rsid w:val="00447475"/>
     <w:rPr>
       <w:rFonts w:asciiTheme="majorHAnsi" w:eastAsiaTheme="majorEastAsia" w:hAnsiTheme="majorHAnsi" w:cstheme="majorBidi"/>
       <w:color w:val="0F4761" w:themeColor="accent1" w:themeShade="BF"/>
@@ -698,7 +877,7 @@
     <w:link w:val="Ttulo2"/>
     <w:uiPriority w:val="9"/>
     <w:semiHidden/>
-    <w:rsid w:val="008418BB"/>
+    <w:rsid w:val="00447475"/>
     <w:rPr>
       <w:rFonts w:asciiTheme="majorHAnsi" w:eastAsiaTheme="majorEastAsia" w:hAnsiTheme="majorHAnsi" w:cstheme="majorBidi"/>
       <w:color w:val="0F4761" w:themeColor="accent1" w:themeShade="BF"/>
@@ -712,7 +891,7 @@
     <w:link w:val="Ttulo3"/>
     <w:uiPriority w:val="9"/>
     <w:semiHidden/>
-    <w:rsid w:val="008418BB"/>
+    <w:rsid w:val="00447475"/>
     <w:rPr>
       <w:rFonts w:eastAsiaTheme="majorEastAsia" w:cstheme="majorBidi"/>
       <w:color w:val="0F4761" w:themeColor="accent1" w:themeShade="BF"/>
@@ -726,7 +905,7 @@
     <w:link w:val="Ttulo4"/>
     <w:uiPriority w:val="9"/>
     <w:semiHidden/>
-    <w:rsid w:val="008418BB"/>
+    <w:rsid w:val="00447475"/>
     <w:rPr>
       <w:rFonts w:eastAsiaTheme="majorEastAsia" w:cstheme="majorBidi"/>
       <w:i/>
@@ -740,7 +919,7 @@
     <w:link w:val="Ttulo5"/>
     <w:uiPriority w:val="9"/>
     <w:semiHidden/>
-    <w:rsid w:val="008418BB"/>
+    <w:rsid w:val="00447475"/>
     <w:rPr>
       <w:rFonts w:eastAsiaTheme="majorEastAsia" w:cstheme="majorBidi"/>
       <w:color w:val="0F4761" w:themeColor="accent1" w:themeShade="BF"/>
@@ -752,7 +931,7 @@
     <w:link w:val="Ttulo6"/>
     <w:uiPriority w:val="9"/>
     <w:semiHidden/>
-    <w:rsid w:val="008418BB"/>
+    <w:rsid w:val="00447475"/>
     <w:rPr>
       <w:rFonts w:eastAsiaTheme="majorEastAsia" w:cstheme="majorBidi"/>
       <w:i/>
@@ -766,7 +945,7 @@
     <w:link w:val="Ttulo7"/>
     <w:uiPriority w:val="9"/>
     <w:semiHidden/>
-    <w:rsid w:val="008418BB"/>
+    <w:rsid w:val="00447475"/>
     <w:rPr>
       <w:rFonts w:eastAsiaTheme="majorEastAsia" w:cstheme="majorBidi"/>
       <w:color w:val="595959" w:themeColor="text1" w:themeTint="A6"/>
@@ -778,7 +957,7 @@
     <w:link w:val="Ttulo8"/>
     <w:uiPriority w:val="9"/>
     <w:semiHidden/>
-    <w:rsid w:val="008418BB"/>
+    <w:rsid w:val="00447475"/>
     <w:rPr>
       <w:rFonts w:eastAsiaTheme="majorEastAsia" w:cstheme="majorBidi"/>
       <w:i/>
@@ -792,7 +971,7 @@
     <w:link w:val="Ttulo9"/>
     <w:uiPriority w:val="9"/>
     <w:semiHidden/>
-    <w:rsid w:val="008418BB"/>
+    <w:rsid w:val="00447475"/>
     <w:rPr>
       <w:rFonts w:eastAsiaTheme="majorEastAsia" w:cstheme="majorBidi"/>
       <w:color w:val="272727" w:themeColor="text1" w:themeTint="D8"/>
@@ -805,7 +984,7 @@
     <w:link w:val="TtuloChar"/>
     <w:uiPriority w:val="10"/>
     <w:qFormat/>
-    <w:rsid w:val="008418BB"/>
+    <w:rsid w:val="00447475"/>
     <w:pPr>
       <w:spacing w:after="80" w:line="240" w:lineRule="auto"/>
       <w:contextualSpacing/>
@@ -823,7 +1002,7 @@
     <w:basedOn w:val="Fontepargpadro"/>
     <w:link w:val="Ttulo"/>
     <w:uiPriority w:val="10"/>
-    <w:rsid w:val="008418BB"/>
+    <w:rsid w:val="00447475"/>
     <w:rPr>
       <w:rFonts w:asciiTheme="majorHAnsi" w:eastAsiaTheme="majorEastAsia" w:hAnsiTheme="majorHAnsi" w:cstheme="majorBidi"/>
       <w:spacing w:val="-10"/>
@@ -839,7 +1018,7 @@
     <w:link w:val="SubttuloChar"/>
     <w:uiPriority w:val="11"/>
     <w:qFormat/>
-    <w:rsid w:val="008418BB"/>
+    <w:rsid w:val="00447475"/>
     <w:pPr>
       <w:numPr>
         <w:ilvl w:val="1"/>
@@ -858,7 +1037,7 @@
     <w:basedOn w:val="Fontepargpadro"/>
     <w:link w:val="Subttulo"/>
     <w:uiPriority w:val="11"/>
-    <w:rsid w:val="008418BB"/>
+    <w:rsid w:val="00447475"/>
     <w:rPr>
       <w:rFonts w:eastAsiaTheme="majorEastAsia" w:cstheme="majorBidi"/>
       <w:color w:val="595959" w:themeColor="text1" w:themeTint="A6"/>
@@ -874,7 +1053,7 @@
     <w:link w:val="CitaoChar"/>
     <w:uiPriority w:val="29"/>
     <w:qFormat/>
-    <w:rsid w:val="008418BB"/>
+    <w:rsid w:val="00447475"/>
     <w:pPr>
       <w:spacing w:before="160"/>
       <w:jc w:val="center"/>
@@ -890,7 +1069,7 @@
     <w:basedOn w:val="Fontepargpadro"/>
     <w:link w:val="Citao"/>
     <w:uiPriority w:val="29"/>
-    <w:rsid w:val="008418BB"/>
+    <w:rsid w:val="00447475"/>
     <w:rPr>
       <w:i/>
       <w:iCs/>
@@ -902,7 +1081,7 @@
     <w:basedOn w:val="Normal"/>
     <w:uiPriority w:val="34"/>
     <w:qFormat/>
-    <w:rsid w:val="008418BB"/>
+    <w:rsid w:val="00447475"/>
     <w:pPr>
       <w:ind w:left="720"/>
       <w:contextualSpacing/>
@@ -913,7 +1092,7 @@
     <w:basedOn w:val="Fontepargpadro"/>
     <w:uiPriority w:val="21"/>
     <w:qFormat/>
-    <w:rsid w:val="008418BB"/>
+    <w:rsid w:val="00447475"/>
     <w:rPr>
       <w:i/>
       <w:iCs/>
@@ -927,7 +1106,7 @@
     <w:link w:val="CitaoIntensaChar"/>
     <w:uiPriority w:val="30"/>
     <w:qFormat/>
-    <w:rsid w:val="008418BB"/>
+    <w:rsid w:val="00447475"/>
     <w:pPr>
       <w:pBdr>
         <w:top w:val="single" w:sz="4" w:space="10" w:color="0F4761" w:themeColor="accent1" w:themeShade="BF"/>
@@ -948,7 +1127,7 @@
     <w:basedOn w:val="Fontepargpadro"/>
     <w:link w:val="CitaoIntensa"/>
     <w:uiPriority w:val="30"/>
-    <w:rsid w:val="008418BB"/>
+    <w:rsid w:val="00447475"/>
     <w:rPr>
       <w:i/>
       <w:iCs/>
@@ -960,7 +1139,7 @@
     <w:basedOn w:val="Fontepargpadro"/>
     <w:uiPriority w:val="32"/>
     <w:qFormat/>
-    <w:rsid w:val="008418BB"/>
+    <w:rsid w:val="00447475"/>
     <w:rPr>
       <w:b/>
       <w:bCs/>

</xml_diff>